<commit_message>
Replace Unit 7 reading previews with coherent family and career stories
</commit_message>
<xml_diff>
--- a/frontend/templates/Revision-Unit-7-Group-213-Reading-Preview.docx
+++ b/frontend/templates/Revision-Unit-7-Group-213-Reading-Preview.docx
@@ -4,40 +4,25 @@
   <w:body>
     <w:p>
       <w:pPr>
-        <w:pStyle w:val="Heading1"/>
+        <w:pStyle w:val="Title"/>
       </w:pPr>
       <w:r>
-        <w:t>Reading preview · Unit 7</w:t>
+        <w:t>Evolve 6 · Unit 7 · Reading preview</w:t>
       </w:r>
     </w:p>
     <w:p>
       <w:r>
-        <w:t>Read the short passage before starting the test. Your teacher will tell you when to begin.</w:t>
+        <w:t>Read this short text before starting the revision test. Your teacher will tell you when to begin.</w:t>
       </w:r>
     </w:p>
     <w:p>
       <w:r>
-        <w:t>An ancestor may leave a relic that connects us to our heritage.</w:t>
-      </w:r>
-    </w:p>
-    <w:p>
-      <w:r>
-        <w:t>Genealogy helps us explore ancestry without reducing identity to ethnicity.</w:t>
-      </w:r>
-    </w:p>
-    <w:p>
-      <w:r>
-        <w:t>A feast can reinvigorate a tradition, and its significance may become a beacon for younger generations.</w:t>
-      </w:r>
-    </w:p>
-    <w:p>
-      <w:r>
-        <w:t>Adoptive families also build shared traditions, even when disagreements cause friction.</w:t>
+        <w:t>When Maya began researching her ancestry, she discovered that her great-grandmother had moved abroad at nineteen. Among the family’s possessions was a small relic from that journey: a handwritten recipe book. Maya decided to prepare some of the dishes for a family feast, hoping to reinvigorate a tradition that had almost disappeared. As relatives shared their memories around the table, she began to understand the significance of those recipes: they preserved a part of the family’s heritage that official records could never capture.</w:t>
       </w:r>
     </w:p>
     <w:sectPr>
       <w:pgSz w:w="11906" w:h="16838"/>
-      <w:pgMar w:top="737" w:right="850" w:bottom="737" w:left="850" w:header="720" w:footer="720" w:gutter="0"/>
+      <w:pgMar w:top="1134" w:right="1134" w:bottom="1134" w:left="1134" w:header="720" w:footer="720" w:gutter="0"/>
       <w:cols w:space="720"/>
       <w:docGrid w:linePitch="360"/>
     </w:sectPr>
@@ -408,12 +393,9 @@
     <w:name w:val="Normal"/>
     <w:qFormat/>
     <w:rsid w:val="00FC693F"/>
-    <w:pPr>
-      <w:spacing w:after="100"/>
-    </w:pPr>
     <w:rPr>
       <w:rFonts w:ascii="Calibri" w:hAnsi="Calibri"/>
-      <w:sz w:val="22"/>
+      <w:sz w:val="24"/>
     </w:rPr>
   </w:style>
   <w:style w:type="paragraph" w:styleId="Header">

</xml_diff>